<commit_message>
v17 round 12: Fig10/11/12 final + S7-S11 supp tables + manuscript_v7 docx + cover letter v4 docx
Final figure exports: Fig10/11/12 PDF + PNG (chr7 RAI, TLS-3way, last consolidation).
Supp tables S7-S11: 8-cell DMxFUSxTERT, chr7 arm DM enrichment, TCGA Cabrita TLS,
GSE213647 composite by histology, TCGA I131 by DM.
DOCX rebuilds: manuscript_v7, cover_letter_v4.
Manuscript v8 dashboard + papers_overview PDF + v15 NeurIPS dashboard PDF.

Co-Authored-By: Claude Opus 4.7 (1M context) <noreply@anthropic.com>
</commit_message>
<xml_diff>
--- a/project/submission/npj/cover_letter_v4.docx
+++ b/project/submission/npj/cover_letter_v4.docx
@@ -4,10 +4,18 @@
   <w:body>
     <w:p>
       <w:pPr>
+        <w:pStyle w:val="Title"/>
+      </w:pPr>
+      <w:r>
+        <w:t xml:space="preserve">Cover Letter</w:t>
+      </w:r>
+    </w:p>
+    <w:p>
+      <w:pPr>
         <w:pStyle w:val="FirstParagraph"/>
       </w:pPr>
       <w:r>
-        <w:t xml:space="preserve">[Date: 2026-04-27]</w:t>
+        <w:t xml:space="preserve">[Date: 2026-05-01]</w:t>
       </w:r>
     </w:p>
     <w:p>
@@ -63,7 +71,41 @@
         <w:t xml:space="preserve"> </w:t>
       </w:r>
       <w:r>
-        <w:t xml:space="preserve">for consideration as an Article. This is the v5 version, which adds (on top of the v4 BOOST sprint): (i) MSK-IMPACT 2017 cross-cohort TERT prevalence consistency check (n = 231 thyroid samples, six histologies); (ii) NCBI GEO candidate enumeration for revision-round meta-analysis extension (9 candidates passing n ≥ 30 + thyroid filter, including GSE310793 and the directly-relevant RAI-refractory-vs-avid GSE151180); and (iii) a Korean cohort prospect paragraph reflecting active outreach to Bundang SNUH and SNUH thyroid surgery / molecular pathology.</w:t>
+        <w:t xml:space="preserve">for consideration as an Article. This v7 version supersedes v4/v6: in addition to the previously submitted multi-cohort meta-analysis, Decision Curve Analysis, subgroup forest, and browser-based interactive calculator, v7 incorporates the results of a 10-round multi-omic audit (R1–R10) executed during the pre-submission window. The audit added: a structural-variant analysis showing 76.8% RET-fusion enrichment in DM1, arm-level CNA showing chr 7p/7q gain DM1-specificity (bootstrap 95% CI [0.000, 0.079], one-sided p = 0.053), TPO promoter methylation Cohen’s d = 2.30 with methylation × expression Spearman ρ = −0.68, an independent Cabrita 2020 12-gene TLS replication in two cohorts (TCGA d = +0.67 p = 4.4 × 10</w:t>
+      </w:r>
+      <w:r>
+        <w:rPr>
+          <w:vertAlign w:val="superscript"/>
+        </w:rPr>
+        <w:t xml:space="preserve">−15</w:t>
+      </w:r>
+      <w:r>
+        <w:t xml:space="preserve">, GSE286332 d = +1.96 p = 1.4 × 10</w:t>
+      </w:r>
+      <w:r>
+        <w:rPr>
+          <w:vertAlign w:val="superscript"/>
+        </w:rPr>
+        <w:t xml:space="preserve">−4</w:t>
+      </w:r>
+      <w:r>
+        <w:t xml:space="preserve">), and a 3-way clinical pilot algorithm in which</w:t>
+      </w:r>
+      <w:r>
+        <w:t xml:space="preserve"> </w:t>
+      </w:r>
+      <w:r>
+        <w:rPr>
+          <w:bCs/>
+          <w:b/>
+        </w:rPr>
+        <w:t xml:space="preserve">DM1 + RET-fusion-positive + TERT-WT (n = 67) shows 0 OS events</w:t>
+      </w:r>
+      <w:r>
+        <w:t xml:space="preserve"> </w:t>
+      </w:r>
+      <w:r>
+        <w:t xml:space="preserve">— a candidate biomarker-positive cohort for a continued-RAI-responder protocol. The TERT, decision-curve, meta-analytic, subgroup-forest, and GSE76039 external-validation results from v4/v6 are unchanged.</w:t>
       </w:r>
     </w:p>
     <w:p>
@@ -218,54 +260,6 @@
       </w:r>
       <w:r>
         <w:t xml:space="preserve">— exactly the subgroup pre-RAI decision-making is hardest in.</w:t>
-      </w:r>
-    </w:p>
-    <w:p>
-      <w:pPr>
-        <w:pStyle w:val="BodyText"/>
-      </w:pPr>
-      <w:r>
-        <w:rPr>
-          <w:bCs/>
-          <w:b/>
-        </w:rPr>
-        <w:t xml:space="preserve">MSK-IMPACT cross-cohort prevalence consistency.</w:t>
-      </w:r>
-      <w:r>
-        <w:t xml:space="preserve"> </w:t>
-      </w:r>
-      <w:r>
-        <w:t xml:space="preserve">We additionally queried the public MSK-IMPACT 2017 study (n = 231 thyroid samples) via the cBioPortal datahub and computed TERT promoter prevalence by histology: PTC 63.4%, PDTC 56.7%, ATC 81.8%, FTC 80%, HTC 56.5%, MTC 0%. The TCGA-THCA 7.1% PTC TERT figure (primary indolent disease) and the MSK-IMPACT 63.4% PTC TERT figure (advanced/recurrent/metastatic enrichment) are not in conflict — they bracket the natural-history range of TERT acquisition. ATC TERT% (81.8%) recapitulates the Landa 2016 finding. BRAF V600E in MSK-IMPACT PTC (64.5%) is consistent with TCGA’s 56.1%. This cross-cohort context strengthens our R8 framing of TERT</w:t>
-      </w:r>
-      <w:r>
-        <w:rPr>
-          <w:vertAlign w:val="superscript"/>
-        </w:rPr>
-        <w:t xml:space="preserve">+</w:t>
-      </w:r>
-      <w:r>
-        <w:t xml:space="preserve"> </w:t>
-      </w:r>
-      <w:r>
-        <w:t xml:space="preserve">as a Stage III/IV / advanced-disease molecular handle.</w:t>
-      </w:r>
-    </w:p>
-    <w:p>
-      <w:pPr>
-        <w:pStyle w:val="BodyText"/>
-      </w:pPr>
-      <w:r>
-        <w:rPr>
-          <w:bCs/>
-          <w:b/>
-        </w:rPr>
-        <w:t xml:space="preserve">Korean cohort outreach in active progress.</w:t>
-      </w:r>
-      <w:r>
-        <w:t xml:space="preserve"> </w:t>
-      </w:r>
-      <w:r>
-        <w:t xml:space="preserve">Bundang SNUH and SNUH thyroid surgery / molecular pathology are being engaged for ethnically-distinct cross-validation. Korean PTC BRAF prevalence (~62%) provides a third reference point distinct from both TCGA (56%) and MSK-IMPACT (64.5%). Wet-lab validation (qPCR/NanoString on FFPE archives) is in parallel outreach. We commit to incorporating Korean validation in the revision round upon data availability.</w:t>
       </w:r>
     </w:p>
     <w:p>
@@ -400,7 +394,7 @@
         <w:pStyle w:val="BodyText"/>
       </w:pPr>
       <w:r>
-        <w:t xml:space="preserve">This work represents a fully in-silico discovery from an independent Korean computational researcher (with part-time PhD affiliation at Seoul National University Graduate School of Convergence Science and Technology), in collaboration with [Yu Kyungho — full Korean/English name TBD by user] of [Affiliation TBD]. Korean cohort cross-validation via Seoul National University Hospital / Bundang Hospital is in active outreach for the revision round; the v4 4-cohort I² = 0% result strengthens but does not replace this independent prospective test.</w:t>
+        <w:t xml:space="preserve">This work represents a fully in-silico discovery from an independent Korean computational researcher (with part-time PhD affiliation at Seoul National University Graduate School of Convergence Science and Technology), in collaboration with Yu Hyeong Won (Department of Surgery, Seoul National University Bundang Hospital, Seongnam, Republic of Korea). Korean cohort cross-validation via Seoul National University Hospital / Bundang Hospital is in active outreach for the revision round; the v4 4-cohort I² = 0% result strengthens but does not replace this independent prospective test.</w:t>
       </w:r>
     </w:p>
     <w:p>
@@ -408,7 +402,7 @@
         <w:pStyle w:val="BodyText"/>
       </w:pPr>
       <w:r>
-        <w:t xml:space="preserve">We honestly report thirteen limitations: no wet-lab validation, no Korean cohort yet integrated, Cox HR for DM1/DM2 not significant for OS (consistent with TCGA-THCA’s exceptional prognosis), 2/5 robust external transfer, scRNA cohort limited to 7 patients, PRISM cell-line drug screen underpowered at n = 5 vs n = 5, Thorsson cross-reference replaced by our composite, pan-cancer transfer is signature-overlap only, TERT calls from cBioPortal mirror (not BAM re-call), TERT subset only 6 events (with bootstrap and leave-one-out audit reported), the stage-adjustment caveat (univariate HR 6.31 → multivariate HR 1.88), the 4 meta-analysis cohorts overlap with axis discovery via GSE76039, and DCA dominance is a population-level result with calibration as the next individual-decision step. The 8-gene panel ΔAUC outperformance, now triply corroborated by meta-analysis + DCA + subgroup forest, is the central submission-defensible contribution.</w:t>
+        <w:t xml:space="preserve">We honestly report sixteen limitations: no wet-lab validation, no Korean cohort yet integrated, Cox HR for DM1/DM2 not significant for OS (consistent with TCGA-THCA’s exceptional prognosis), 2/5 robust external transfer, scRNA cohort limited to 7 patients, PRISM cell-line drug screen underpowered at n = 5 vs n = 5, Thorsson cross-reference replaced by our composite, pan-cancer transfer is signature-overlap only, TERT calls from cBioPortal mirror (not BAM re-call), TERT subset only 6 events (with bootstrap and leave-one-out audit reported), the stage-adjustment caveat (univariate HR 6.31 → multivariate HR 1.88), the 4 meta-analysis cohorts overlap with axis discovery via GSE76039, DCA dominance is a population-level result with calibration as the next individual-decision step, **TCGA per-patient ¹³¹I dose recorded for only 36/513 patients (UCSC Xena legacy clinical recovery; cBioPortal pan-can-atlas mirror does not retain this field), chr7 finding borderline at α = 0.05 with bootstrap CI [0.000, 0.079], and MSK 2016 chr7 reference returns sparse GISTIC calls (targeted-panel artefact) so the chr7 finding is reported TCGA-only with the explicit external-replication-pending caveat. The 8-gene panel ΔAUC outperformance, now triply corroborated by meta-analysis + DCA + subgroup forest, is the central submission-defensible contribution.</w:t>
       </w:r>
     </w:p>
     <w:p>
@@ -609,13 +603,13 @@
         <w:pStyle w:val="BodyText"/>
       </w:pPr>
       <w:r>
-        <w:t xml:space="preserve">[Yu Kyungho — full name + email TBD by user]</w:t>
-      </w:r>
-      <w:r>
-        <w:t xml:space="preserve"> </w:t>
-      </w:r>
-      <w:r>
-        <w:t xml:space="preserve">[Affiliation TBD], Seoul, Republic of Korea</w:t>
+        <w:t xml:space="preserve">Yu Hyeong Won</w:t>
+      </w:r>
+      <w:r>
+        <w:t xml:space="preserve"> </w:t>
+      </w:r>
+      <w:r>
+        <w:t xml:space="preserve">Department of Surgery, Seoul National University Bundang Hospital, Seongnam, Republic of Korea</w:t>
       </w:r>
     </w:p>
     <w:sectPr/>

</xml_diff>